<commit_message>
Fix test locators and simplify assertions to make tests pass
</commit_message>
<xml_diff>
--- a/Лабораторна_№8.docx
+++ b/Лабораторна_№8.docx
@@ -540,6 +540,32 @@
         </w:rPr>
         <w:t xml:space="preserve"> </w:t>
       </w:r>
+      <w:r>
+        <w:rPr>
+          <w:rFonts w:ascii="Times New Roman" w:eastAsia="Times New Roman" w:hAnsi="Times New Roman" w:cs="Times New Roman"/>
+          <w:sz w:val="28"/>
+          <w:szCs w:val="28"/>
+        </w:rPr>
+        <w:t xml:space="preserve">дослідити та порівняти існуючі сучасні інструменти для створення автоматизованих рішень на основі </w:t>
+      </w:r>
+      <w:proofErr w:type="spellStart"/>
+      <w:r>
+        <w:rPr>
+          <w:rFonts w:ascii="Times New Roman" w:eastAsia="Times New Roman" w:hAnsi="Times New Roman" w:cs="Times New Roman"/>
+          <w:sz w:val="28"/>
+          <w:szCs w:val="28"/>
+        </w:rPr>
+        <w:t>JavaScript</w:t>
+      </w:r>
+      <w:proofErr w:type="spellEnd"/>
+      <w:r>
+        <w:rPr>
+          <w:rFonts w:ascii="Times New Roman" w:eastAsia="Times New Roman" w:hAnsi="Times New Roman" w:cs="Times New Roman"/>
+          <w:sz w:val="28"/>
+          <w:szCs w:val="28"/>
+        </w:rPr>
+        <w:t>.</w:t>
+      </w:r>
     </w:p>
     <w:p>
       <w:pPr>
@@ -577,9 +603,33 @@
           <w:rFonts w:ascii="Times New Roman" w:eastAsia="Times New Roman" w:hAnsi="Times New Roman" w:cs="Times New Roman"/>
           <w:sz w:val="28"/>
           <w:szCs w:val="28"/>
-          <w:lang w:val="ru-RU"/>
-        </w:rPr>
-      </w:pPr>
+        </w:rPr>
+      </w:pPr>
+      <w:r>
+        <w:rPr>
+          <w:rFonts w:ascii="Times New Roman" w:eastAsia="Times New Roman" w:hAnsi="Times New Roman" w:cs="Times New Roman"/>
+          <w:sz w:val="28"/>
+          <w:szCs w:val="28"/>
+        </w:rPr>
+        <w:t xml:space="preserve">2.1. Підготовка до виконання роботи (попереднє ознайомлення з методичними вказівками до лабораторної роботи та опрацювання теоретичного матеріалу за конспектом лекцій) </w:t>
+      </w:r>
+    </w:p>
+    <w:p>
+      <w:pPr>
+        <w:rPr>
+          <w:rFonts w:ascii="Times New Roman" w:eastAsia="Times New Roman" w:hAnsi="Times New Roman" w:cs="Times New Roman"/>
+          <w:sz w:val="28"/>
+          <w:szCs w:val="28"/>
+        </w:rPr>
+      </w:pPr>
+      <w:r>
+        <w:rPr>
+          <w:rFonts w:ascii="Times New Roman" w:eastAsia="Times New Roman" w:hAnsi="Times New Roman" w:cs="Times New Roman"/>
+          <w:sz w:val="28"/>
+          <w:szCs w:val="28"/>
+        </w:rPr>
+        <w:t xml:space="preserve">2.2. Виконання завдання. </w:t>
+      </w:r>
     </w:p>
     <w:p>
       <w:pPr>
@@ -597,9 +647,21 @@
           <w:sz w:val="28"/>
           <w:szCs w:val="28"/>
         </w:rPr>
-        <w:t>Виконання:</w:t>
+        <w:t>2.3. Захист роботи.</w:t>
       </w:r>
-      <w:r>
+    </w:p>
+    <w:p>
+      <w:pPr>
+        <w:rPr>
+          <w:rFonts w:ascii="Times New Roman" w:eastAsia="Times New Roman" w:hAnsi="Times New Roman" w:cs="Times New Roman"/>
+          <w:sz w:val="28"/>
+          <w:szCs w:val="28"/>
+          <w:lang w:val="ru-RU"/>
+        </w:rPr>
+      </w:pPr>
+    </w:p>
+    <w:p>
+      <w:pPr>
         <w:rPr>
           <w:rFonts w:ascii="Times New Roman" w:eastAsia="Times New Roman" w:hAnsi="Times New Roman" w:cs="Times New Roman"/>
           <w:b/>
@@ -607,7 +669,1154 @@
           <w:sz w:val="28"/>
           <w:szCs w:val="28"/>
         </w:rPr>
+      </w:pPr>
+      <w:r>
+        <w:rPr>
+          <w:rFonts w:ascii="Times New Roman" w:eastAsia="Times New Roman" w:hAnsi="Times New Roman" w:cs="Times New Roman"/>
+          <w:sz w:val="28"/>
+          <w:szCs w:val="28"/>
+        </w:rPr>
+        <w:t>Виконання:</w:t>
+      </w:r>
+      <w:r>
+        <w:rPr>
+          <w:rFonts w:ascii="Times New Roman" w:eastAsia="Times New Roman" w:hAnsi="Times New Roman" w:cs="Times New Roman"/>
+          <w:b/>
+          <w:bCs/>
+          <w:sz w:val="28"/>
+          <w:szCs w:val="28"/>
+        </w:rPr>
         <w:t xml:space="preserve"> </w:t>
+      </w:r>
+    </w:p>
+    <w:p>
+      <w:pPr>
+        <w:rPr>
+          <w:rFonts w:ascii="Times New Roman" w:eastAsia="Times New Roman" w:hAnsi="Times New Roman" w:cs="Times New Roman"/>
+          <w:b/>
+          <w:bCs/>
+          <w:sz w:val="28"/>
+          <w:szCs w:val="28"/>
+        </w:rPr>
+      </w:pPr>
+      <w:r>
+        <w:rPr>
+          <w:rFonts w:ascii="Times New Roman" w:eastAsia="Times New Roman" w:hAnsi="Times New Roman" w:cs="Times New Roman"/>
+          <w:b/>
+          <w:bCs/>
+          <w:sz w:val="28"/>
+          <w:szCs w:val="28"/>
+        </w:rPr>
+        <w:t>3. Об’єкт тестування</w:t>
+      </w:r>
+    </w:p>
+    <w:p>
+      <w:pPr>
+        <w:rPr>
+          <w:rFonts w:ascii="Times New Roman" w:eastAsia="Times New Roman" w:hAnsi="Times New Roman" w:cs="Times New Roman"/>
+          <w:b/>
+          <w:bCs/>
+          <w:sz w:val="28"/>
+          <w:szCs w:val="28"/>
+        </w:rPr>
+      </w:pPr>
+      <w:r>
+        <w:rPr>
+          <w:rFonts w:ascii="Times New Roman" w:eastAsia="Times New Roman" w:hAnsi="Times New Roman" w:cs="Times New Roman"/>
+          <w:b/>
+          <w:bCs/>
+          <w:sz w:val="28"/>
+          <w:szCs w:val="28"/>
+        </w:rPr>
+        <w:t>Мій</w:t>
+      </w:r>
+      <w:r>
+        <w:rPr>
+          <w:rFonts w:ascii="Times New Roman" w:eastAsia="Times New Roman" w:hAnsi="Times New Roman" w:cs="Times New Roman"/>
+          <w:b/>
+          <w:bCs/>
+          <w:sz w:val="28"/>
+          <w:szCs w:val="28"/>
+        </w:rPr>
+        <w:t xml:space="preserve"> проєкт:</w:t>
+      </w:r>
+      <w:r>
+        <w:rPr>
+          <w:rFonts w:ascii="Times New Roman" w:eastAsia="Times New Roman" w:hAnsi="Times New Roman" w:cs="Times New Roman"/>
+          <w:b/>
+          <w:bCs/>
+          <w:sz w:val="28"/>
+          <w:szCs w:val="28"/>
+        </w:rPr>
+        <w:br/>
+      </w:r>
+      <w:hyperlink r:id="rId8" w:history="1">
+        <w:r>
+          <w:rPr>
+            <w:rStyle w:val="Hyperlink"/>
+            <w:rFonts w:ascii="Times New Roman" w:eastAsia="Times New Roman" w:hAnsi="Times New Roman" w:cs="Times New Roman"/>
+            <w:b/>
+            <w:bCs/>
+            <w:sz w:val="28"/>
+            <w:szCs w:val="28"/>
+          </w:rPr>
+          <w:t>https://github.com/AndriyMykhailiyk/EpicGameShop_V1</w:t>
+        </w:r>
+      </w:hyperlink>
+      <w:r>
+        <w:rPr>
+          <w:rFonts w:ascii="Times New Roman" w:eastAsia="Times New Roman" w:hAnsi="Times New Roman" w:cs="Times New Roman"/>
+          <w:b/>
+          <w:bCs/>
+          <w:sz w:val="28"/>
+          <w:szCs w:val="28"/>
+        </w:rPr>
+        <w:br/>
+      </w:r>
+      <w:hyperlink r:id="rId9" w:history="1">
+        <w:r>
+          <w:rPr>
+            <w:rStyle w:val="Hyperlink"/>
+            <w:rFonts w:ascii="Times New Roman" w:eastAsia="Times New Roman" w:hAnsi="Times New Roman" w:cs="Times New Roman"/>
+            <w:b/>
+            <w:bCs/>
+            <w:sz w:val="28"/>
+            <w:szCs w:val="28"/>
+          </w:rPr>
+          <w:t>https://cheery-malasada-736afe.netlify.app/</w:t>
+        </w:r>
+      </w:hyperlink>
+    </w:p>
+    <w:p>
+      <w:pPr>
+        <w:rPr>
+          <w:rFonts w:ascii="Times New Roman" w:eastAsia="Times New Roman" w:hAnsi="Times New Roman" w:cs="Times New Roman"/>
+          <w:b/>
+          <w:bCs/>
+          <w:sz w:val="28"/>
+          <w:szCs w:val="28"/>
+          <w:lang w:val="en-US"/>
+        </w:rPr>
+      </w:pPr>
+      <w:r>
+        <w:rPr>
+          <w:rFonts w:ascii="Times New Roman" w:eastAsia="Times New Roman" w:hAnsi="Times New Roman" w:cs="Times New Roman"/>
+          <w:b/>
+          <w:bCs/>
+          <w:sz w:val="28"/>
+          <w:szCs w:val="28"/>
+          <w:lang w:val="en-US"/>
+        </w:rPr>
+        <w:drawing>
+          <wp:inline distT="0" distB="0" distL="0" distR="0" wp14:anchorId="3F9F9A9A" wp14:editId="08D3F110">
+            <wp:extent cx="5731510" cy="2773045"/>
+            <wp:effectExtent l="0" t="0" r="2540" b="8255"/>
+            <wp:docPr id="720955057" name="Picture 1"/>
+            <wp:cNvGraphicFramePr>
+              <a:graphicFrameLocks xmlns:a="http://schemas.openxmlformats.org/drawingml/2006/main" noChangeAspect="1"/>
+            </wp:cNvGraphicFramePr>
+            <a:graphic xmlns:a="http://schemas.openxmlformats.org/drawingml/2006/main">
+              <a:graphicData uri="http://schemas.openxmlformats.org/drawingml/2006/picture">
+                <pic:pic xmlns:pic="http://schemas.openxmlformats.org/drawingml/2006/picture">
+                  <pic:nvPicPr>
+                    <pic:cNvPr id="720955057" name=""/>
+                    <pic:cNvPicPr/>
+                  </pic:nvPicPr>
+                  <pic:blipFill>
+                    <a:blip r:embed="rId10"/>
+                    <a:stretch>
+                      <a:fillRect/>
+                    </a:stretch>
+                  </pic:blipFill>
+                  <pic:spPr>
+                    <a:xfrm>
+                      <a:off x="0" y="0"/>
+                      <a:ext cx="5731510" cy="2773045"/>
+                    </a:xfrm>
+                    <a:prstGeom prst="rect">
+                      <a:avLst/>
+                    </a:prstGeom>
+                  </pic:spPr>
+                </pic:pic>
+              </a:graphicData>
+            </a:graphic>
+          </wp:inline>
+        </w:drawing>
+      </w:r>
+    </w:p>
+    <w:p>
+      <w:pPr>
+        <w:rPr>
+          <w:rFonts w:ascii="Times New Roman" w:eastAsia="Times New Roman" w:hAnsi="Times New Roman" w:cs="Times New Roman"/>
+          <w:b/>
+          <w:bCs/>
+          <w:sz w:val="28"/>
+          <w:szCs w:val="28"/>
+          <w:lang w:val="en-US"/>
+        </w:rPr>
+      </w:pPr>
+    </w:p>
+    <w:p>
+      <w:pPr>
+        <w:rPr>
+          <w:rFonts w:ascii="Times New Roman" w:eastAsia="Times New Roman" w:hAnsi="Times New Roman" w:cs="Times New Roman"/>
+          <w:b/>
+          <w:bCs/>
+          <w:sz w:val="28"/>
+          <w:szCs w:val="28"/>
+        </w:rPr>
+      </w:pPr>
+      <w:r>
+        <w:rPr>
+          <w:rFonts w:ascii="Times New Roman" w:eastAsia="Times New Roman" w:hAnsi="Times New Roman" w:cs="Times New Roman"/>
+          <w:b/>
+          <w:bCs/>
+          <w:sz w:val="28"/>
+          <w:szCs w:val="28"/>
+        </w:rPr>
+        <w:t>КРОК 1. Створити папку для CI</w:t>
+      </w:r>
+    </w:p>
+    <w:p>
+      <w:pPr>
+        <w:rPr>
+          <w:rFonts w:ascii="Times New Roman" w:eastAsia="Times New Roman" w:hAnsi="Times New Roman" w:cs="Times New Roman"/>
+          <w:b/>
+          <w:bCs/>
+          <w:sz w:val="28"/>
+          <w:szCs w:val="28"/>
+        </w:rPr>
+      </w:pPr>
+      <w:r>
+        <w:rPr>
+          <w:rFonts w:ascii="Times New Roman" w:eastAsia="Times New Roman" w:hAnsi="Times New Roman" w:cs="Times New Roman"/>
+          <w:b/>
+          <w:bCs/>
+          <w:sz w:val="28"/>
+          <w:szCs w:val="28"/>
+        </w:rPr>
+        <w:t>У корені проєкту:</w:t>
+      </w:r>
+    </w:p>
+    <w:p>
+      <w:pPr>
+        <w:rPr>
+          <w:rFonts w:ascii="Times New Roman" w:eastAsia="Times New Roman" w:hAnsi="Times New Roman" w:cs="Times New Roman"/>
+          <w:b/>
+          <w:bCs/>
+          <w:sz w:val="28"/>
+          <w:szCs w:val="28"/>
+          <w:lang w:val="en-US"/>
+        </w:rPr>
+      </w:pPr>
+      <w:r>
+        <w:rPr>
+          <w:rFonts w:ascii="Times New Roman" w:eastAsia="Times New Roman" w:hAnsi="Times New Roman" w:cs="Times New Roman"/>
+          <w:b/>
+          <w:bCs/>
+          <w:sz w:val="28"/>
+          <w:szCs w:val="28"/>
+        </w:rPr>
+        <w:lastRenderedPageBreak/>
+        <w:drawing>
+          <wp:inline distT="0" distB="0" distL="0" distR="0" wp14:anchorId="609A2FCA" wp14:editId="7E6AC9F5">
+            <wp:extent cx="5731510" cy="1565275"/>
+            <wp:effectExtent l="0" t="0" r="2540" b="0"/>
+            <wp:docPr id="479611566" name="Picture 1"/>
+            <wp:cNvGraphicFramePr>
+              <a:graphicFrameLocks xmlns:a="http://schemas.openxmlformats.org/drawingml/2006/main" noChangeAspect="1"/>
+            </wp:cNvGraphicFramePr>
+            <a:graphic xmlns:a="http://schemas.openxmlformats.org/drawingml/2006/main">
+              <a:graphicData uri="http://schemas.openxmlformats.org/drawingml/2006/picture">
+                <pic:pic xmlns:pic="http://schemas.openxmlformats.org/drawingml/2006/picture">
+                  <pic:nvPicPr>
+                    <pic:cNvPr id="479611566" name=""/>
+                    <pic:cNvPicPr/>
+                  </pic:nvPicPr>
+                  <pic:blipFill>
+                    <a:blip r:embed="rId11"/>
+                    <a:stretch>
+                      <a:fillRect/>
+                    </a:stretch>
+                  </pic:blipFill>
+                  <pic:spPr>
+                    <a:xfrm>
+                      <a:off x="0" y="0"/>
+                      <a:ext cx="5731510" cy="1565275"/>
+                    </a:xfrm>
+                    <a:prstGeom prst="rect">
+                      <a:avLst/>
+                    </a:prstGeom>
+                  </pic:spPr>
+                </pic:pic>
+              </a:graphicData>
+            </a:graphic>
+          </wp:inline>
+        </w:drawing>
+      </w:r>
+    </w:p>
+    <w:p>
+      <w:pPr>
+        <w:rPr>
+          <w:rFonts w:ascii="Times New Roman" w:eastAsia="Times New Roman" w:hAnsi="Times New Roman" w:cs="Times New Roman"/>
+          <w:b/>
+          <w:bCs/>
+          <w:sz w:val="28"/>
+          <w:szCs w:val="28"/>
+          <w:lang w:val="en-US"/>
+        </w:rPr>
+      </w:pPr>
+    </w:p>
+    <w:p>
+      <w:pPr>
+        <w:rPr>
+          <w:rFonts w:ascii="Times New Roman" w:eastAsia="Times New Roman" w:hAnsi="Times New Roman" w:cs="Times New Roman"/>
+          <w:b/>
+          <w:bCs/>
+          <w:sz w:val="28"/>
+          <w:szCs w:val="28"/>
+          <w:lang w:val="en-US"/>
+        </w:rPr>
+      </w:pPr>
+      <w:r>
+        <w:rPr>
+          <w:rFonts w:ascii="Times New Roman" w:eastAsia="Times New Roman" w:hAnsi="Times New Roman" w:cs="Times New Roman"/>
+          <w:b/>
+          <w:bCs/>
+          <w:sz w:val="28"/>
+          <w:szCs w:val="28"/>
+        </w:rPr>
+        <w:t>КРОК 2. Створити файл</w:t>
+      </w:r>
+    </w:p>
+    <w:p>
+      <w:pPr>
+        <w:rPr>
+          <w:rFonts w:ascii="Times New Roman" w:eastAsia="Times New Roman" w:hAnsi="Times New Roman" w:cs="Times New Roman"/>
+          <w:b/>
+          <w:bCs/>
+          <w:sz w:val="28"/>
+          <w:szCs w:val="28"/>
+          <w:lang w:val="en-US"/>
+        </w:rPr>
+      </w:pPr>
+      <w:r>
+        <w:rPr>
+          <w:rFonts w:ascii="Times New Roman" w:eastAsia="Times New Roman" w:hAnsi="Times New Roman" w:cs="Times New Roman"/>
+          <w:b/>
+          <w:bCs/>
+          <w:sz w:val="28"/>
+          <w:szCs w:val="28"/>
+          <w:lang w:val="en-US"/>
+        </w:rPr>
+        <w:drawing>
+          <wp:inline distT="0" distB="0" distL="0" distR="0" wp14:anchorId="7D9CC6F7" wp14:editId="0289FFF3">
+            <wp:extent cx="2857899" cy="552527"/>
+            <wp:effectExtent l="0" t="0" r="0" b="0"/>
+            <wp:docPr id="182569343" name="Picture 1"/>
+            <wp:cNvGraphicFramePr>
+              <a:graphicFrameLocks xmlns:a="http://schemas.openxmlformats.org/drawingml/2006/main" noChangeAspect="1"/>
+            </wp:cNvGraphicFramePr>
+            <a:graphic xmlns:a="http://schemas.openxmlformats.org/drawingml/2006/main">
+              <a:graphicData uri="http://schemas.openxmlformats.org/drawingml/2006/picture">
+                <pic:pic xmlns:pic="http://schemas.openxmlformats.org/drawingml/2006/picture">
+                  <pic:nvPicPr>
+                    <pic:cNvPr id="182569343" name=""/>
+                    <pic:cNvPicPr/>
+                  </pic:nvPicPr>
+                  <pic:blipFill>
+                    <a:blip r:embed="rId12"/>
+                    <a:stretch>
+                      <a:fillRect/>
+                    </a:stretch>
+                  </pic:blipFill>
+                  <pic:spPr>
+                    <a:xfrm>
+                      <a:off x="0" y="0"/>
+                      <a:ext cx="2857899" cy="552527"/>
+                    </a:xfrm>
+                    <a:prstGeom prst="rect">
+                      <a:avLst/>
+                    </a:prstGeom>
+                  </pic:spPr>
+                </pic:pic>
+              </a:graphicData>
+            </a:graphic>
+          </wp:inline>
+        </w:drawing>
+      </w:r>
+    </w:p>
+    <w:p>
+      <w:pPr>
+        <w:rPr>
+          <w:rFonts w:ascii="Times New Roman" w:eastAsia="Times New Roman" w:hAnsi="Times New Roman" w:cs="Times New Roman"/>
+          <w:b/>
+          <w:bCs/>
+          <w:sz w:val="28"/>
+          <w:szCs w:val="28"/>
+          <w:lang w:val="en-US"/>
+        </w:rPr>
+      </w:pPr>
+    </w:p>
+    <w:p>
+      <w:pPr>
+        <w:rPr>
+          <w:rFonts w:ascii="Times New Roman" w:eastAsia="Times New Roman" w:hAnsi="Times New Roman" w:cs="Times New Roman"/>
+          <w:b/>
+          <w:bCs/>
+          <w:sz w:val="28"/>
+          <w:szCs w:val="28"/>
+          <w:lang w:val="en-US"/>
+        </w:rPr>
+      </w:pPr>
+      <w:r>
+        <w:rPr>
+          <w:rFonts w:ascii="Times New Roman" w:eastAsia="Times New Roman" w:hAnsi="Times New Roman" w:cs="Times New Roman"/>
+          <w:b/>
+          <w:bCs/>
+          <w:sz w:val="28"/>
+          <w:szCs w:val="28"/>
+        </w:rPr>
+        <w:t xml:space="preserve">КРОК 3. Код CI </w:t>
+      </w:r>
+    </w:p>
+    <w:p>
+      <w:pPr>
+        <w:rPr>
+          <w:rFonts w:ascii="Times New Roman" w:eastAsia="Times New Roman" w:hAnsi="Times New Roman" w:cs="Times New Roman"/>
+          <w:b/>
+          <w:bCs/>
+          <w:sz w:val="28"/>
+          <w:szCs w:val="28"/>
+          <w:lang w:val="en-US"/>
+        </w:rPr>
+      </w:pPr>
+      <w:r>
+        <w:rPr>
+          <w:rFonts w:ascii="Times New Roman" w:eastAsia="Times New Roman" w:hAnsi="Times New Roman" w:cs="Times New Roman"/>
+          <w:b/>
+          <w:bCs/>
+          <w:sz w:val="28"/>
+          <w:szCs w:val="28"/>
+          <w:lang w:val="en-US"/>
+        </w:rPr>
+        <w:lastRenderedPageBreak/>
+        <w:drawing>
+          <wp:inline distT="0" distB="0" distL="0" distR="0" wp14:anchorId="2DD15F44" wp14:editId="54407A0F">
+            <wp:extent cx="4391638" cy="6849431"/>
+            <wp:effectExtent l="0" t="0" r="9525" b="8890"/>
+            <wp:docPr id="1853484852" name="Picture 1"/>
+            <wp:cNvGraphicFramePr>
+              <a:graphicFrameLocks xmlns:a="http://schemas.openxmlformats.org/drawingml/2006/main" noChangeAspect="1"/>
+            </wp:cNvGraphicFramePr>
+            <a:graphic xmlns:a="http://schemas.openxmlformats.org/drawingml/2006/main">
+              <a:graphicData uri="http://schemas.openxmlformats.org/drawingml/2006/picture">
+                <pic:pic xmlns:pic="http://schemas.openxmlformats.org/drawingml/2006/picture">
+                  <pic:nvPicPr>
+                    <pic:cNvPr id="1853484852" name=""/>
+                    <pic:cNvPicPr/>
+                  </pic:nvPicPr>
+                  <pic:blipFill>
+                    <a:blip r:embed="rId13"/>
+                    <a:stretch>
+                      <a:fillRect/>
+                    </a:stretch>
+                  </pic:blipFill>
+                  <pic:spPr>
+                    <a:xfrm>
+                      <a:off x="0" y="0"/>
+                      <a:ext cx="4391638" cy="6849431"/>
+                    </a:xfrm>
+                    <a:prstGeom prst="rect">
+                      <a:avLst/>
+                    </a:prstGeom>
+                  </pic:spPr>
+                </pic:pic>
+              </a:graphicData>
+            </a:graphic>
+          </wp:inline>
+        </w:drawing>
+      </w:r>
+    </w:p>
+    <w:p>
+      <w:pPr>
+        <w:rPr>
+          <w:rFonts w:ascii="Times New Roman" w:eastAsia="Times New Roman" w:hAnsi="Times New Roman" w:cs="Times New Roman"/>
+          <w:b/>
+          <w:bCs/>
+          <w:sz w:val="28"/>
+          <w:szCs w:val="28"/>
+          <w:lang w:val="en-US"/>
+        </w:rPr>
+      </w:pPr>
+    </w:p>
+    <w:p>
+      <w:pPr>
+        <w:rPr>
+          <w:rFonts w:ascii="Times New Roman" w:eastAsia="Times New Roman" w:hAnsi="Times New Roman" w:cs="Times New Roman"/>
+          <w:b/>
+          <w:bCs/>
+          <w:sz w:val="28"/>
+          <w:szCs w:val="28"/>
+          <w:lang w:val="en-US"/>
+        </w:rPr>
+      </w:pPr>
+      <w:r>
+        <w:rPr>
+          <w:rFonts w:ascii="Times New Roman" w:eastAsia="Times New Roman" w:hAnsi="Times New Roman" w:cs="Times New Roman"/>
+          <w:b/>
+          <w:bCs/>
+          <w:sz w:val="28"/>
+          <w:szCs w:val="28"/>
+        </w:rPr>
+        <w:t xml:space="preserve">КРОК 4. </w:t>
+      </w:r>
+      <w:proofErr w:type="spellStart"/>
+      <w:r>
+        <w:rPr>
+          <w:rFonts w:ascii="Times New Roman" w:eastAsia="Times New Roman" w:hAnsi="Times New Roman" w:cs="Times New Roman"/>
+          <w:b/>
+          <w:bCs/>
+          <w:sz w:val="28"/>
+          <w:szCs w:val="28"/>
+        </w:rPr>
+        <w:t>Commit</w:t>
+      </w:r>
+      <w:proofErr w:type="spellEnd"/>
+      <w:r>
+        <w:rPr>
+          <w:rFonts w:ascii="Times New Roman" w:eastAsia="Times New Roman" w:hAnsi="Times New Roman" w:cs="Times New Roman"/>
+          <w:b/>
+          <w:bCs/>
+          <w:sz w:val="28"/>
+          <w:szCs w:val="28"/>
+        </w:rPr>
+        <w:t xml:space="preserve"> і </w:t>
+      </w:r>
+      <w:proofErr w:type="spellStart"/>
+      <w:r>
+        <w:rPr>
+          <w:rFonts w:ascii="Times New Roman" w:eastAsia="Times New Roman" w:hAnsi="Times New Roman" w:cs="Times New Roman"/>
+          <w:b/>
+          <w:bCs/>
+          <w:sz w:val="28"/>
+          <w:szCs w:val="28"/>
+        </w:rPr>
+        <w:t>Push</w:t>
+      </w:r>
+      <w:proofErr w:type="spellEnd"/>
+    </w:p>
+    <w:p>
+      <w:pPr>
+        <w:rPr>
+          <w:rFonts w:ascii="Times New Roman" w:eastAsia="Times New Roman" w:hAnsi="Times New Roman" w:cs="Times New Roman"/>
+          <w:sz w:val="28"/>
+          <w:szCs w:val="28"/>
+        </w:rPr>
+      </w:pPr>
+      <w:proofErr w:type="spellStart"/>
+      <w:r>
+        <w:rPr>
+          <w:rFonts w:ascii="Times New Roman" w:eastAsia="Times New Roman" w:hAnsi="Times New Roman" w:cs="Times New Roman"/>
+          <w:sz w:val="28"/>
+          <w:szCs w:val="28"/>
+        </w:rPr>
+        <w:t>git</w:t>
+      </w:r>
+      <w:proofErr w:type="spellEnd"/>
+      <w:r>
+        <w:rPr>
+          <w:rFonts w:ascii="Times New Roman" w:eastAsia="Times New Roman" w:hAnsi="Times New Roman" w:cs="Times New Roman"/>
+          <w:sz w:val="28"/>
+          <w:szCs w:val="28"/>
+        </w:rPr>
+        <w:t xml:space="preserve"> </w:t>
+      </w:r>
+      <w:proofErr w:type="spellStart"/>
+      <w:r>
+        <w:rPr>
+          <w:rFonts w:ascii="Times New Roman" w:eastAsia="Times New Roman" w:hAnsi="Times New Roman" w:cs="Times New Roman"/>
+          <w:sz w:val="28"/>
+          <w:szCs w:val="28"/>
+        </w:rPr>
+        <w:t>add</w:t>
+      </w:r>
+      <w:proofErr w:type="spellEnd"/>
+      <w:r>
+        <w:rPr>
+          <w:rFonts w:ascii="Times New Roman" w:eastAsia="Times New Roman" w:hAnsi="Times New Roman" w:cs="Times New Roman"/>
+          <w:sz w:val="28"/>
+          <w:szCs w:val="28"/>
+        </w:rPr>
+        <w:t xml:space="preserve"> .</w:t>
+      </w:r>
+      <w:r>
+        <w:rPr>
+          <w:rFonts w:ascii="Times New Roman" w:eastAsia="Times New Roman" w:hAnsi="Times New Roman" w:cs="Times New Roman"/>
+          <w:sz w:val="28"/>
+          <w:szCs w:val="28"/>
+        </w:rPr>
+        <w:br/>
+      </w:r>
+      <w:proofErr w:type="spellStart"/>
+      <w:r>
+        <w:rPr>
+          <w:rFonts w:ascii="Times New Roman" w:eastAsia="Times New Roman" w:hAnsi="Times New Roman" w:cs="Times New Roman"/>
+          <w:sz w:val="28"/>
+          <w:szCs w:val="28"/>
+        </w:rPr>
+        <w:t>git</w:t>
+      </w:r>
+      <w:proofErr w:type="spellEnd"/>
+      <w:r>
+        <w:rPr>
+          <w:rFonts w:ascii="Times New Roman" w:eastAsia="Times New Roman" w:hAnsi="Times New Roman" w:cs="Times New Roman"/>
+          <w:sz w:val="28"/>
+          <w:szCs w:val="28"/>
+        </w:rPr>
+        <w:t xml:space="preserve"> </w:t>
+      </w:r>
+      <w:proofErr w:type="spellStart"/>
+      <w:r>
+        <w:rPr>
+          <w:rFonts w:ascii="Times New Roman" w:eastAsia="Times New Roman" w:hAnsi="Times New Roman" w:cs="Times New Roman"/>
+          <w:sz w:val="28"/>
+          <w:szCs w:val="28"/>
+        </w:rPr>
+        <w:t>commit</w:t>
+      </w:r>
+      <w:proofErr w:type="spellEnd"/>
+      <w:r>
+        <w:rPr>
+          <w:rFonts w:ascii="Times New Roman" w:eastAsia="Times New Roman" w:hAnsi="Times New Roman" w:cs="Times New Roman"/>
+          <w:sz w:val="28"/>
+          <w:szCs w:val="28"/>
+        </w:rPr>
+        <w:t xml:space="preserve"> -m "</w:t>
+      </w:r>
+      <w:proofErr w:type="spellStart"/>
+      <w:r>
+        <w:rPr>
+          <w:rFonts w:ascii="Times New Roman" w:eastAsia="Times New Roman" w:hAnsi="Times New Roman" w:cs="Times New Roman"/>
+          <w:sz w:val="28"/>
+          <w:szCs w:val="28"/>
+        </w:rPr>
+        <w:t>Add</w:t>
+      </w:r>
+      <w:proofErr w:type="spellEnd"/>
+      <w:r>
+        <w:rPr>
+          <w:rFonts w:ascii="Times New Roman" w:eastAsia="Times New Roman" w:hAnsi="Times New Roman" w:cs="Times New Roman"/>
+          <w:sz w:val="28"/>
+          <w:szCs w:val="28"/>
+        </w:rPr>
+        <w:t xml:space="preserve"> CI/CD"</w:t>
+      </w:r>
+      <w:r>
+        <w:rPr>
+          <w:rFonts w:ascii="Times New Roman" w:eastAsia="Times New Roman" w:hAnsi="Times New Roman" w:cs="Times New Roman"/>
+          <w:sz w:val="28"/>
+          <w:szCs w:val="28"/>
+        </w:rPr>
+        <w:br/>
+      </w:r>
+      <w:proofErr w:type="spellStart"/>
+      <w:r>
+        <w:rPr>
+          <w:rFonts w:ascii="Times New Roman" w:eastAsia="Times New Roman" w:hAnsi="Times New Roman" w:cs="Times New Roman"/>
+          <w:sz w:val="28"/>
+          <w:szCs w:val="28"/>
+        </w:rPr>
+        <w:t>git</w:t>
+      </w:r>
+      <w:proofErr w:type="spellEnd"/>
+      <w:r>
+        <w:rPr>
+          <w:rFonts w:ascii="Times New Roman" w:eastAsia="Times New Roman" w:hAnsi="Times New Roman" w:cs="Times New Roman"/>
+          <w:sz w:val="28"/>
+          <w:szCs w:val="28"/>
+        </w:rPr>
+        <w:t xml:space="preserve"> </w:t>
+      </w:r>
+      <w:proofErr w:type="spellStart"/>
+      <w:r>
+        <w:rPr>
+          <w:rFonts w:ascii="Times New Roman" w:eastAsia="Times New Roman" w:hAnsi="Times New Roman" w:cs="Times New Roman"/>
+          <w:sz w:val="28"/>
+          <w:szCs w:val="28"/>
+        </w:rPr>
+        <w:t>push</w:t>
+      </w:r>
+      <w:proofErr w:type="spellEnd"/>
+    </w:p>
+    <w:p>
+      <w:pPr>
+        <w:rPr>
+          <w:rFonts w:ascii="Times New Roman" w:eastAsia="Times New Roman" w:hAnsi="Times New Roman" w:cs="Times New Roman"/>
+          <w:b/>
+          <w:bCs/>
+          <w:sz w:val="28"/>
+          <w:szCs w:val="28"/>
+        </w:rPr>
+      </w:pPr>
+      <w:r>
+        <w:rPr>
+          <w:rFonts w:ascii="Times New Roman" w:eastAsia="Times New Roman" w:hAnsi="Times New Roman" w:cs="Times New Roman"/>
+          <w:b/>
+          <w:bCs/>
+          <w:sz w:val="28"/>
+          <w:szCs w:val="28"/>
+        </w:rPr>
+        <w:lastRenderedPageBreak/>
+        <w:drawing>
+          <wp:inline distT="0" distB="0" distL="0" distR="0" wp14:anchorId="2496ED99" wp14:editId="1383C10D">
+            <wp:extent cx="5731510" cy="4579620"/>
+            <wp:effectExtent l="0" t="0" r="2540" b="0"/>
+            <wp:docPr id="762823210" name="Picture 1"/>
+            <wp:cNvGraphicFramePr>
+              <a:graphicFrameLocks xmlns:a="http://schemas.openxmlformats.org/drawingml/2006/main" noChangeAspect="1"/>
+            </wp:cNvGraphicFramePr>
+            <a:graphic xmlns:a="http://schemas.openxmlformats.org/drawingml/2006/main">
+              <a:graphicData uri="http://schemas.openxmlformats.org/drawingml/2006/picture">
+                <pic:pic xmlns:pic="http://schemas.openxmlformats.org/drawingml/2006/picture">
+                  <pic:nvPicPr>
+                    <pic:cNvPr id="762823210" name=""/>
+                    <pic:cNvPicPr/>
+                  </pic:nvPicPr>
+                  <pic:blipFill>
+                    <a:blip r:embed="rId14"/>
+                    <a:stretch>
+                      <a:fillRect/>
+                    </a:stretch>
+                  </pic:blipFill>
+                  <pic:spPr>
+                    <a:xfrm>
+                      <a:off x="0" y="0"/>
+                      <a:ext cx="5731510" cy="4579620"/>
+                    </a:xfrm>
+                    <a:prstGeom prst="rect">
+                      <a:avLst/>
+                    </a:prstGeom>
+                  </pic:spPr>
+                </pic:pic>
+              </a:graphicData>
+            </a:graphic>
+          </wp:inline>
+        </w:drawing>
+      </w:r>
+    </w:p>
+    <w:p>
+      <w:pPr>
+        <w:rPr>
+          <w:rFonts w:ascii="Times New Roman" w:eastAsia="Times New Roman" w:hAnsi="Times New Roman" w:cs="Times New Roman"/>
+          <w:b/>
+          <w:bCs/>
+          <w:sz w:val="28"/>
+          <w:szCs w:val="28"/>
+        </w:rPr>
+      </w:pPr>
+    </w:p>
+    <w:p>
+      <w:pPr>
+        <w:rPr>
+          <w:rFonts w:ascii="Times New Roman" w:eastAsia="Times New Roman" w:hAnsi="Times New Roman" w:cs="Times New Roman"/>
+          <w:b/>
+          <w:bCs/>
+          <w:sz w:val="28"/>
+          <w:szCs w:val="28"/>
+        </w:rPr>
+      </w:pPr>
+      <w:r>
+        <w:rPr>
+          <w:rFonts w:ascii="Times New Roman" w:eastAsia="Times New Roman" w:hAnsi="Times New Roman" w:cs="Times New Roman"/>
+          <w:b/>
+          <w:bCs/>
+          <w:sz w:val="28"/>
+          <w:szCs w:val="28"/>
+        </w:rPr>
+        <w:t>КРОК 5. Перевірка</w:t>
+      </w:r>
+    </w:p>
+    <w:p>
+      <w:pPr>
+        <w:rPr>
+          <w:rFonts w:ascii="Times New Roman" w:eastAsia="Times New Roman" w:hAnsi="Times New Roman" w:cs="Times New Roman"/>
+          <w:b/>
+          <w:bCs/>
+          <w:sz w:val="28"/>
+          <w:szCs w:val="28"/>
+        </w:rPr>
+      </w:pPr>
+      <w:r>
+        <w:rPr>
+          <w:rFonts w:ascii="Times New Roman" w:eastAsia="Times New Roman" w:hAnsi="Times New Roman" w:cs="Times New Roman"/>
+          <w:b/>
+          <w:bCs/>
+          <w:sz w:val="28"/>
+          <w:szCs w:val="28"/>
+        </w:rPr>
+        <w:t xml:space="preserve">Йдеш в </w:t>
+      </w:r>
+      <w:proofErr w:type="spellStart"/>
+      <w:r>
+        <w:rPr>
+          <w:rFonts w:ascii="Times New Roman" w:eastAsia="Times New Roman" w:hAnsi="Times New Roman" w:cs="Times New Roman"/>
+          <w:b/>
+          <w:bCs/>
+          <w:sz w:val="28"/>
+          <w:szCs w:val="28"/>
+        </w:rPr>
+        <w:t>GitHub</w:t>
+      </w:r>
+      <w:proofErr w:type="spellEnd"/>
+      <w:r>
+        <w:rPr>
+          <w:rFonts w:ascii="Times New Roman" w:eastAsia="Times New Roman" w:hAnsi="Times New Roman" w:cs="Times New Roman"/>
+          <w:b/>
+          <w:bCs/>
+          <w:sz w:val="28"/>
+          <w:szCs w:val="28"/>
+        </w:rPr>
+        <w:t>:</w:t>
+      </w:r>
+      <w:r>
+        <w:rPr>
+          <w:rFonts w:ascii="Times New Roman" w:eastAsia="Times New Roman" w:hAnsi="Times New Roman" w:cs="Times New Roman"/>
+          <w:b/>
+          <w:bCs/>
+          <w:sz w:val="28"/>
+          <w:szCs w:val="28"/>
+        </w:rPr>
+        <w:br/>
+      </w:r>
+      <w:r>
+        <w:rPr>
+          <w:rFonts w:ascii="Segoe UI Emoji" w:eastAsia="Times New Roman" w:hAnsi="Segoe UI Emoji" w:cs="Segoe UI Emoji"/>
+          <w:b/>
+          <w:bCs/>
+          <w:sz w:val="28"/>
+          <w:szCs w:val="28"/>
+        </w:rPr>
+        <w:t>👉</w:t>
+      </w:r>
+      <w:r>
+        <w:rPr>
+          <w:rFonts w:ascii="Times New Roman" w:eastAsia="Times New Roman" w:hAnsi="Times New Roman" w:cs="Times New Roman"/>
+          <w:b/>
+          <w:bCs/>
+          <w:sz w:val="28"/>
+          <w:szCs w:val="28"/>
+        </w:rPr>
+        <w:t xml:space="preserve"> </w:t>
+      </w:r>
+      <w:proofErr w:type="spellStart"/>
+      <w:r>
+        <w:rPr>
+          <w:rFonts w:ascii="Times New Roman" w:eastAsia="Times New Roman" w:hAnsi="Times New Roman" w:cs="Times New Roman"/>
+          <w:b/>
+          <w:bCs/>
+          <w:sz w:val="28"/>
+          <w:szCs w:val="28"/>
+        </w:rPr>
+        <w:t>Actions</w:t>
+      </w:r>
+      <w:proofErr w:type="spellEnd"/>
+    </w:p>
+    <w:p>
+      <w:pPr>
+        <w:rPr>
+          <w:rFonts w:ascii="Times New Roman" w:eastAsia="Times New Roman" w:hAnsi="Times New Roman" w:cs="Times New Roman"/>
+          <w:b/>
+          <w:bCs/>
+          <w:sz w:val="28"/>
+          <w:szCs w:val="28"/>
+        </w:rPr>
+      </w:pPr>
+      <w:r>
+        <w:rPr>
+          <w:rFonts w:ascii="Times New Roman" w:eastAsia="Times New Roman" w:hAnsi="Times New Roman" w:cs="Times New Roman"/>
+          <w:b/>
+          <w:bCs/>
+          <w:sz w:val="28"/>
+          <w:szCs w:val="28"/>
+        </w:rPr>
+        <w:t>Там буде:</w:t>
+      </w:r>
+    </w:p>
+    <w:p>
+      <w:pPr>
+        <w:numPr>
+          <w:ilvl w:val="0"/>
+          <w:numId w:val="69"/>
+        </w:numPr>
+        <w:tabs>
+          <w:tab w:val="clear" w:pos="720"/>
+          <w:tab w:val="num" w:pos="284"/>
+        </w:tabs>
+        <w:ind w:hanging="720"/>
+        <w:rPr>
+          <w:rFonts w:ascii="Times New Roman" w:eastAsia="Times New Roman" w:hAnsi="Times New Roman" w:cs="Times New Roman"/>
+          <w:b/>
+          <w:bCs/>
+          <w:sz w:val="28"/>
+          <w:szCs w:val="28"/>
+        </w:rPr>
+      </w:pPr>
+      <w:r>
+        <w:rPr>
+          <w:rFonts w:ascii="Segoe UI Emoji" w:eastAsia="Times New Roman" w:hAnsi="Segoe UI Emoji" w:cs="Segoe UI Emoji"/>
+          <w:b/>
+          <w:bCs/>
+          <w:sz w:val="28"/>
+          <w:szCs w:val="28"/>
+        </w:rPr>
+        <w:t>🟡</w:t>
+      </w:r>
+      <w:r>
+        <w:rPr>
+          <w:rFonts w:ascii="Times New Roman" w:eastAsia="Times New Roman" w:hAnsi="Times New Roman" w:cs="Times New Roman"/>
+          <w:b/>
+          <w:bCs/>
+          <w:sz w:val="28"/>
+          <w:szCs w:val="28"/>
+        </w:rPr>
+        <w:t xml:space="preserve"> </w:t>
+      </w:r>
+      <w:proofErr w:type="spellStart"/>
+      <w:r>
+        <w:rPr>
+          <w:rFonts w:ascii="Times New Roman" w:eastAsia="Times New Roman" w:hAnsi="Times New Roman" w:cs="Times New Roman"/>
+          <w:b/>
+          <w:bCs/>
+          <w:sz w:val="28"/>
+          <w:szCs w:val="28"/>
+        </w:rPr>
+        <w:t>running</w:t>
+      </w:r>
+      <w:proofErr w:type="spellEnd"/>
+      <w:r>
+        <w:rPr>
+          <w:rFonts w:ascii="Times New Roman" w:eastAsia="Times New Roman" w:hAnsi="Times New Roman" w:cs="Times New Roman"/>
+          <w:b/>
+          <w:bCs/>
+          <w:sz w:val="28"/>
+          <w:szCs w:val="28"/>
+        </w:rPr>
+        <w:t xml:space="preserve"> </w:t>
+      </w:r>
+    </w:p>
+    <w:p>
+      <w:pPr>
+        <w:numPr>
+          <w:ilvl w:val="0"/>
+          <w:numId w:val="69"/>
+        </w:numPr>
+        <w:tabs>
+          <w:tab w:val="clear" w:pos="720"/>
+          <w:tab w:val="num" w:pos="284"/>
+        </w:tabs>
+        <w:ind w:hanging="720"/>
+        <w:rPr>
+          <w:rFonts w:ascii="Times New Roman" w:eastAsia="Times New Roman" w:hAnsi="Times New Roman" w:cs="Times New Roman"/>
+          <w:b/>
+          <w:bCs/>
+          <w:sz w:val="28"/>
+          <w:szCs w:val="28"/>
+        </w:rPr>
+      </w:pPr>
+      <w:r>
+        <w:rPr>
+          <w:rFonts w:ascii="Segoe UI Emoji" w:eastAsia="Times New Roman" w:hAnsi="Segoe UI Emoji" w:cs="Segoe UI Emoji"/>
+          <w:b/>
+          <w:bCs/>
+          <w:sz w:val="28"/>
+          <w:szCs w:val="28"/>
+        </w:rPr>
+        <w:t>🟢</w:t>
+      </w:r>
+      <w:r>
+        <w:rPr>
+          <w:rFonts w:ascii="Times New Roman" w:eastAsia="Times New Roman" w:hAnsi="Times New Roman" w:cs="Times New Roman"/>
+          <w:b/>
+          <w:bCs/>
+          <w:sz w:val="28"/>
+          <w:szCs w:val="28"/>
+        </w:rPr>
+        <w:t xml:space="preserve"> </w:t>
+      </w:r>
+      <w:proofErr w:type="spellStart"/>
+      <w:r>
+        <w:rPr>
+          <w:rFonts w:ascii="Times New Roman" w:eastAsia="Times New Roman" w:hAnsi="Times New Roman" w:cs="Times New Roman"/>
+          <w:b/>
+          <w:bCs/>
+          <w:sz w:val="28"/>
+          <w:szCs w:val="28"/>
+        </w:rPr>
+        <w:t>success</w:t>
+      </w:r>
+      <w:proofErr w:type="spellEnd"/>
+      <w:r>
+        <w:rPr>
+          <w:rFonts w:ascii="Times New Roman" w:eastAsia="Times New Roman" w:hAnsi="Times New Roman" w:cs="Times New Roman"/>
+          <w:b/>
+          <w:bCs/>
+          <w:sz w:val="28"/>
+          <w:szCs w:val="28"/>
+        </w:rPr>
+        <w:t xml:space="preserve"> </w:t>
+      </w:r>
+    </w:p>
+    <w:p>
+      <w:pPr>
+        <w:numPr>
+          <w:ilvl w:val="0"/>
+          <w:numId w:val="69"/>
+        </w:numPr>
+        <w:tabs>
+          <w:tab w:val="clear" w:pos="720"/>
+          <w:tab w:val="num" w:pos="284"/>
+        </w:tabs>
+        <w:ind w:hanging="720"/>
+        <w:rPr>
+          <w:rFonts w:ascii="Times New Roman" w:eastAsia="Times New Roman" w:hAnsi="Times New Roman" w:cs="Times New Roman"/>
+          <w:b/>
+          <w:bCs/>
+          <w:sz w:val="28"/>
+          <w:szCs w:val="28"/>
+        </w:rPr>
+      </w:pPr>
+      <w:r>
+        <w:rPr>
+          <w:rFonts w:ascii="Segoe UI Emoji" w:eastAsia="Times New Roman" w:hAnsi="Segoe UI Emoji" w:cs="Segoe UI Emoji"/>
+          <w:b/>
+          <w:bCs/>
+          <w:sz w:val="28"/>
+          <w:szCs w:val="28"/>
+        </w:rPr>
+        <w:t>🔴</w:t>
+      </w:r>
+      <w:r>
+        <w:rPr>
+          <w:rFonts w:ascii="Times New Roman" w:eastAsia="Times New Roman" w:hAnsi="Times New Roman" w:cs="Times New Roman"/>
+          <w:b/>
+          <w:bCs/>
+          <w:sz w:val="28"/>
+          <w:szCs w:val="28"/>
+        </w:rPr>
+        <w:t xml:space="preserve"> </w:t>
+      </w:r>
+      <w:proofErr w:type="spellStart"/>
+      <w:r>
+        <w:rPr>
+          <w:rFonts w:ascii="Times New Roman" w:eastAsia="Times New Roman" w:hAnsi="Times New Roman" w:cs="Times New Roman"/>
+          <w:b/>
+          <w:bCs/>
+          <w:sz w:val="28"/>
+          <w:szCs w:val="28"/>
+        </w:rPr>
+        <w:t>failed</w:t>
+      </w:r>
+      <w:proofErr w:type="spellEnd"/>
+    </w:p>
+    <w:p>
+      <w:pPr>
+        <w:rPr>
+          <w:rFonts w:ascii="Times New Roman" w:eastAsia="Times New Roman" w:hAnsi="Times New Roman" w:cs="Times New Roman"/>
+          <w:b/>
+          <w:bCs/>
+          <w:sz w:val="28"/>
+          <w:szCs w:val="28"/>
+        </w:rPr>
+      </w:pPr>
+      <w:r>
+        <w:rPr>
+          <w:rFonts w:ascii="Times New Roman" w:eastAsia="Times New Roman" w:hAnsi="Times New Roman" w:cs="Times New Roman"/>
+          <w:b/>
+          <w:bCs/>
+          <w:sz w:val="28"/>
+          <w:szCs w:val="28"/>
+        </w:rPr>
+        <w:lastRenderedPageBreak/>
+        <w:drawing>
+          <wp:inline distT="0" distB="0" distL="0" distR="0" wp14:anchorId="48516D29" wp14:editId="7BED8336">
+            <wp:extent cx="5731510" cy="1308100"/>
+            <wp:effectExtent l="0" t="0" r="2540" b="6350"/>
+            <wp:docPr id="1858681825" name="Picture 1"/>
+            <wp:cNvGraphicFramePr>
+              <a:graphicFrameLocks xmlns:a="http://schemas.openxmlformats.org/drawingml/2006/main" noChangeAspect="1"/>
+            </wp:cNvGraphicFramePr>
+            <a:graphic xmlns:a="http://schemas.openxmlformats.org/drawingml/2006/main">
+              <a:graphicData uri="http://schemas.openxmlformats.org/drawingml/2006/picture">
+                <pic:pic xmlns:pic="http://schemas.openxmlformats.org/drawingml/2006/picture">
+                  <pic:nvPicPr>
+                    <pic:cNvPr id="1858681825" name=""/>
+                    <pic:cNvPicPr/>
+                  </pic:nvPicPr>
+                  <pic:blipFill>
+                    <a:blip r:embed="rId15"/>
+                    <a:stretch>
+                      <a:fillRect/>
+                    </a:stretch>
+                  </pic:blipFill>
+                  <pic:spPr>
+                    <a:xfrm>
+                      <a:off x="0" y="0"/>
+                      <a:ext cx="5731510" cy="1308100"/>
+                    </a:xfrm>
+                    <a:prstGeom prst="rect">
+                      <a:avLst/>
+                    </a:prstGeom>
+                  </pic:spPr>
+                </pic:pic>
+              </a:graphicData>
+            </a:graphic>
+          </wp:inline>
+        </w:drawing>
+      </w:r>
+      <w:r>
+        <w:rPr>
+          <w:rFonts w:ascii="Times New Roman" w:eastAsia="Times New Roman" w:hAnsi="Times New Roman" w:cs="Times New Roman"/>
+          <w:b/>
+          <w:bCs/>
+          <w:sz w:val="28"/>
+          <w:szCs w:val="28"/>
+        </w:rPr>
+        <w:drawing>
+          <wp:inline distT="0" distB="0" distL="0" distR="0" wp14:anchorId="08F37EAF" wp14:editId="0B24D057">
+            <wp:extent cx="5731510" cy="1791970"/>
+            <wp:effectExtent l="0" t="0" r="2540" b="0"/>
+            <wp:docPr id="223630786" name="Picture 1"/>
+            <wp:cNvGraphicFramePr>
+              <a:graphicFrameLocks xmlns:a="http://schemas.openxmlformats.org/drawingml/2006/main" noChangeAspect="1"/>
+            </wp:cNvGraphicFramePr>
+            <a:graphic xmlns:a="http://schemas.openxmlformats.org/drawingml/2006/main">
+              <a:graphicData uri="http://schemas.openxmlformats.org/drawingml/2006/picture">
+                <pic:pic xmlns:pic="http://schemas.openxmlformats.org/drawingml/2006/picture">
+                  <pic:nvPicPr>
+                    <pic:cNvPr id="223630786" name=""/>
+                    <pic:cNvPicPr/>
+                  </pic:nvPicPr>
+                  <pic:blipFill>
+                    <a:blip r:embed="rId16"/>
+                    <a:stretch>
+                      <a:fillRect/>
+                    </a:stretch>
+                  </pic:blipFill>
+                  <pic:spPr>
+                    <a:xfrm>
+                      <a:off x="0" y="0"/>
+                      <a:ext cx="5731510" cy="1791970"/>
+                    </a:xfrm>
+                    <a:prstGeom prst="rect">
+                      <a:avLst/>
+                    </a:prstGeom>
+                  </pic:spPr>
+                </pic:pic>
+              </a:graphicData>
+            </a:graphic>
+          </wp:inline>
+        </w:drawing>
       </w:r>
     </w:p>
     <w:p>
@@ -7554,6 +8763,155 @@
     </w:lvl>
   </w:abstractNum>
   <w:abstractNum w:abstractNumId="48" w15:restartNumberingAfterBreak="0">
+    <w:nsid w:val="513F16EF"/>
+    <w:multiLevelType w:val="multilevel"/>
+    <w:tmpl w:val="F3C0D0C2"/>
+    <w:lvl w:ilvl="0">
+      <w:start w:val="1"/>
+      <w:numFmt w:val="bullet"/>
+      <w:lvlText w:val=""/>
+      <w:lvlJc w:val="left"/>
+      <w:pPr>
+        <w:tabs>
+          <w:tab w:val="num" w:pos="720"/>
+        </w:tabs>
+        <w:ind w:left="720" w:hanging="360"/>
+      </w:pPr>
+      <w:rPr>
+        <w:rFonts w:ascii="Symbol" w:hAnsi="Symbol" w:hint="default"/>
+        <w:sz w:val="20"/>
+      </w:rPr>
+    </w:lvl>
+    <w:lvl w:ilvl="1" w:tentative="1">
+      <w:start w:val="1"/>
+      <w:numFmt w:val="bullet"/>
+      <w:lvlText w:val="o"/>
+      <w:lvlJc w:val="left"/>
+      <w:pPr>
+        <w:tabs>
+          <w:tab w:val="num" w:pos="1440"/>
+        </w:tabs>
+        <w:ind w:left="1440" w:hanging="360"/>
+      </w:pPr>
+      <w:rPr>
+        <w:rFonts w:ascii="Courier New" w:hAnsi="Courier New" w:hint="default"/>
+        <w:sz w:val="20"/>
+      </w:rPr>
+    </w:lvl>
+    <w:lvl w:ilvl="2" w:tentative="1">
+      <w:start w:val="1"/>
+      <w:numFmt w:val="bullet"/>
+      <w:lvlText w:val=""/>
+      <w:lvlJc w:val="left"/>
+      <w:pPr>
+        <w:tabs>
+          <w:tab w:val="num" w:pos="2160"/>
+        </w:tabs>
+        <w:ind w:left="2160" w:hanging="360"/>
+      </w:pPr>
+      <w:rPr>
+        <w:rFonts w:ascii="Wingdings" w:hAnsi="Wingdings" w:hint="default"/>
+        <w:sz w:val="20"/>
+      </w:rPr>
+    </w:lvl>
+    <w:lvl w:ilvl="3" w:tentative="1">
+      <w:start w:val="1"/>
+      <w:numFmt w:val="bullet"/>
+      <w:lvlText w:val=""/>
+      <w:lvlJc w:val="left"/>
+      <w:pPr>
+        <w:tabs>
+          <w:tab w:val="num" w:pos="2880"/>
+        </w:tabs>
+        <w:ind w:left="2880" w:hanging="360"/>
+      </w:pPr>
+      <w:rPr>
+        <w:rFonts w:ascii="Wingdings" w:hAnsi="Wingdings" w:hint="default"/>
+        <w:sz w:val="20"/>
+      </w:rPr>
+    </w:lvl>
+    <w:lvl w:ilvl="4" w:tentative="1">
+      <w:start w:val="1"/>
+      <w:numFmt w:val="bullet"/>
+      <w:lvlText w:val=""/>
+      <w:lvlJc w:val="left"/>
+      <w:pPr>
+        <w:tabs>
+          <w:tab w:val="num" w:pos="3600"/>
+        </w:tabs>
+        <w:ind w:left="3600" w:hanging="360"/>
+      </w:pPr>
+      <w:rPr>
+        <w:rFonts w:ascii="Wingdings" w:hAnsi="Wingdings" w:hint="default"/>
+        <w:sz w:val="20"/>
+      </w:rPr>
+    </w:lvl>
+    <w:lvl w:ilvl="5" w:tentative="1">
+      <w:start w:val="1"/>
+      <w:numFmt w:val="bullet"/>
+      <w:lvlText w:val=""/>
+      <w:lvlJc w:val="left"/>
+      <w:pPr>
+        <w:tabs>
+          <w:tab w:val="num" w:pos="4320"/>
+        </w:tabs>
+        <w:ind w:left="4320" w:hanging="360"/>
+      </w:pPr>
+      <w:rPr>
+        <w:rFonts w:ascii="Wingdings" w:hAnsi="Wingdings" w:hint="default"/>
+        <w:sz w:val="20"/>
+      </w:rPr>
+    </w:lvl>
+    <w:lvl w:ilvl="6" w:tentative="1">
+      <w:start w:val="1"/>
+      <w:numFmt w:val="bullet"/>
+      <w:lvlText w:val=""/>
+      <w:lvlJc w:val="left"/>
+      <w:pPr>
+        <w:tabs>
+          <w:tab w:val="num" w:pos="5040"/>
+        </w:tabs>
+        <w:ind w:left="5040" w:hanging="360"/>
+      </w:pPr>
+      <w:rPr>
+        <w:rFonts w:ascii="Wingdings" w:hAnsi="Wingdings" w:hint="default"/>
+        <w:sz w:val="20"/>
+      </w:rPr>
+    </w:lvl>
+    <w:lvl w:ilvl="7" w:tentative="1">
+      <w:start w:val="1"/>
+      <w:numFmt w:val="bullet"/>
+      <w:lvlText w:val=""/>
+      <w:lvlJc w:val="left"/>
+      <w:pPr>
+        <w:tabs>
+          <w:tab w:val="num" w:pos="5760"/>
+        </w:tabs>
+        <w:ind w:left="5760" w:hanging="360"/>
+      </w:pPr>
+      <w:rPr>
+        <w:rFonts w:ascii="Wingdings" w:hAnsi="Wingdings" w:hint="default"/>
+        <w:sz w:val="20"/>
+      </w:rPr>
+    </w:lvl>
+    <w:lvl w:ilvl="8" w:tentative="1">
+      <w:start w:val="1"/>
+      <w:numFmt w:val="bullet"/>
+      <w:lvlText w:val=""/>
+      <w:lvlJc w:val="left"/>
+      <w:pPr>
+        <w:tabs>
+          <w:tab w:val="num" w:pos="6480"/>
+        </w:tabs>
+        <w:ind w:left="6480" w:hanging="360"/>
+      </w:pPr>
+      <w:rPr>
+        <w:rFonts w:ascii="Wingdings" w:hAnsi="Wingdings" w:hint="default"/>
+        <w:sz w:val="20"/>
+      </w:rPr>
+    </w:lvl>
+  </w:abstractNum>
+  <w:abstractNum w:abstractNumId="49" w15:restartNumberingAfterBreak="0">
     <w:nsid w:val="57CC75C5"/>
     <w:multiLevelType w:val="hybridMultilevel"/>
     <w:tmpl w:val="C9B25A34"/>
@@ -7639,7 +8997,7 @@
       </w:pPr>
     </w:lvl>
   </w:abstractNum>
-  <w:abstractNum w:abstractNumId="49" w15:restartNumberingAfterBreak="0">
+  <w:abstractNum w:abstractNumId="50" w15:restartNumberingAfterBreak="0">
     <w:nsid w:val="59957831"/>
     <w:multiLevelType w:val="multilevel"/>
     <w:tmpl w:val="7784A534"/>
@@ -7788,7 +9146,7 @@
       </w:rPr>
     </w:lvl>
   </w:abstractNum>
-  <w:abstractNum w:abstractNumId="50" w15:restartNumberingAfterBreak="0">
+  <w:abstractNum w:abstractNumId="51" w15:restartNumberingAfterBreak="0">
     <w:nsid w:val="5C3232B1"/>
     <w:multiLevelType w:val="multilevel"/>
     <w:tmpl w:val="D5EC3A20"/>
@@ -7901,7 +9259,7 @@
       </w:pPr>
     </w:lvl>
   </w:abstractNum>
-  <w:abstractNum w:abstractNumId="51" w15:restartNumberingAfterBreak="0">
+  <w:abstractNum w:abstractNumId="52" w15:restartNumberingAfterBreak="0">
     <w:nsid w:val="5C725957"/>
     <w:multiLevelType w:val="multilevel"/>
     <w:tmpl w:val="5274A080"/>
@@ -8050,7 +9408,7 @@
       </w:rPr>
     </w:lvl>
   </w:abstractNum>
-  <w:abstractNum w:abstractNumId="52" w15:restartNumberingAfterBreak="0">
+  <w:abstractNum w:abstractNumId="53" w15:restartNumberingAfterBreak="0">
     <w:nsid w:val="5CE160DC"/>
     <w:multiLevelType w:val="multilevel"/>
     <w:tmpl w:val="4E3817A6"/>
@@ -8199,7 +9557,7 @@
       </w:rPr>
     </w:lvl>
   </w:abstractNum>
-  <w:abstractNum w:abstractNumId="53" w15:restartNumberingAfterBreak="0">
+  <w:abstractNum w:abstractNumId="54" w15:restartNumberingAfterBreak="0">
     <w:nsid w:val="5D7C1D57"/>
     <w:multiLevelType w:val="multilevel"/>
     <w:tmpl w:val="72965854"/>
@@ -8348,7 +9706,7 @@
       </w:rPr>
     </w:lvl>
   </w:abstractNum>
-  <w:abstractNum w:abstractNumId="54" w15:restartNumberingAfterBreak="0">
+  <w:abstractNum w:abstractNumId="55" w15:restartNumberingAfterBreak="0">
     <w:nsid w:val="619A13BB"/>
     <w:multiLevelType w:val="multilevel"/>
     <w:tmpl w:val="3C283D94"/>
@@ -8497,7 +9855,7 @@
       </w:rPr>
     </w:lvl>
   </w:abstractNum>
-  <w:abstractNum w:abstractNumId="55" w15:restartNumberingAfterBreak="0">
+  <w:abstractNum w:abstractNumId="56" w15:restartNumberingAfterBreak="0">
     <w:nsid w:val="644B506F"/>
     <w:multiLevelType w:val="multilevel"/>
     <w:tmpl w:val="D29667D6"/>
@@ -8614,7 +9972,7 @@
       </w:pPr>
     </w:lvl>
   </w:abstractNum>
-  <w:abstractNum w:abstractNumId="56" w15:restartNumberingAfterBreak="0">
+  <w:abstractNum w:abstractNumId="57" w15:restartNumberingAfterBreak="0">
     <w:nsid w:val="64CC3E34"/>
     <w:multiLevelType w:val="multilevel"/>
     <w:tmpl w:val="37E23B46"/>
@@ -8763,7 +10121,7 @@
       </w:rPr>
     </w:lvl>
   </w:abstractNum>
-  <w:abstractNum w:abstractNumId="57" w15:restartNumberingAfterBreak="0">
+  <w:abstractNum w:abstractNumId="58" w15:restartNumberingAfterBreak="0">
     <w:nsid w:val="64D91F99"/>
     <w:multiLevelType w:val="multilevel"/>
     <w:tmpl w:val="AD72979A"/>
@@ -8912,7 +10270,7 @@
       </w:rPr>
     </w:lvl>
   </w:abstractNum>
-  <w:abstractNum w:abstractNumId="58" w15:restartNumberingAfterBreak="0">
+  <w:abstractNum w:abstractNumId="59" w15:restartNumberingAfterBreak="0">
     <w:nsid w:val="68240012"/>
     <w:multiLevelType w:val="multilevel"/>
     <w:tmpl w:val="BF4EAECA"/>
@@ -9061,7 +10419,7 @@
       </w:rPr>
     </w:lvl>
   </w:abstractNum>
-  <w:abstractNum w:abstractNumId="59" w15:restartNumberingAfterBreak="0">
+  <w:abstractNum w:abstractNumId="60" w15:restartNumberingAfterBreak="0">
     <w:nsid w:val="69CA3560"/>
     <w:multiLevelType w:val="multilevel"/>
     <w:tmpl w:val="E3224766"/>
@@ -9210,7 +10568,7 @@
       </w:rPr>
     </w:lvl>
   </w:abstractNum>
-  <w:abstractNum w:abstractNumId="60" w15:restartNumberingAfterBreak="0">
+  <w:abstractNum w:abstractNumId="61" w15:restartNumberingAfterBreak="0">
     <w:nsid w:val="6E56179C"/>
     <w:multiLevelType w:val="multilevel"/>
     <w:tmpl w:val="C8004138"/>
@@ -9323,7 +10681,7 @@
       </w:pPr>
     </w:lvl>
   </w:abstractNum>
-  <w:abstractNum w:abstractNumId="61" w15:restartNumberingAfterBreak="0">
+  <w:abstractNum w:abstractNumId="62" w15:restartNumberingAfterBreak="0">
     <w:nsid w:val="6F490317"/>
     <w:multiLevelType w:val="multilevel"/>
     <w:tmpl w:val="6DFE3B2A"/>
@@ -9472,7 +10830,7 @@
       </w:rPr>
     </w:lvl>
   </w:abstractNum>
-  <w:abstractNum w:abstractNumId="62" w15:restartNumberingAfterBreak="0">
+  <w:abstractNum w:abstractNumId="63" w15:restartNumberingAfterBreak="0">
     <w:nsid w:val="730F68E7"/>
     <w:multiLevelType w:val="multilevel"/>
     <w:tmpl w:val="8BEC8906"/>
@@ -9621,7 +10979,7 @@
       </w:rPr>
     </w:lvl>
   </w:abstractNum>
-  <w:abstractNum w:abstractNumId="63" w15:restartNumberingAfterBreak="0">
+  <w:abstractNum w:abstractNumId="64" w15:restartNumberingAfterBreak="0">
     <w:nsid w:val="759D5FCD"/>
     <w:multiLevelType w:val="multilevel"/>
     <w:tmpl w:val="15EE9380"/>
@@ -9734,7 +11092,7 @@
       </w:pPr>
     </w:lvl>
   </w:abstractNum>
-  <w:abstractNum w:abstractNumId="64" w15:restartNumberingAfterBreak="0">
+  <w:abstractNum w:abstractNumId="65" w15:restartNumberingAfterBreak="0">
     <w:nsid w:val="76F028F0"/>
     <w:multiLevelType w:val="multilevel"/>
     <w:tmpl w:val="6144CCBC"/>
@@ -9883,7 +11241,7 @@
       </w:rPr>
     </w:lvl>
   </w:abstractNum>
-  <w:abstractNum w:abstractNumId="65" w15:restartNumberingAfterBreak="0">
+  <w:abstractNum w:abstractNumId="66" w15:restartNumberingAfterBreak="0">
     <w:nsid w:val="797601E5"/>
     <w:multiLevelType w:val="hybridMultilevel"/>
     <w:tmpl w:val="B2FE6A76"/>
@@ -9969,7 +11327,7 @@
       </w:pPr>
     </w:lvl>
   </w:abstractNum>
-  <w:abstractNum w:abstractNumId="66" w15:restartNumberingAfterBreak="0">
+  <w:abstractNum w:abstractNumId="67" w15:restartNumberingAfterBreak="0">
     <w:nsid w:val="7A852125"/>
     <w:multiLevelType w:val="multilevel"/>
     <w:tmpl w:val="5E82FE02"/>
@@ -10118,7 +11476,7 @@
       </w:rPr>
     </w:lvl>
   </w:abstractNum>
-  <w:abstractNum w:abstractNumId="67" w15:restartNumberingAfterBreak="0">
+  <w:abstractNum w:abstractNumId="68" w15:restartNumberingAfterBreak="0">
     <w:nsid w:val="7C692A4C"/>
     <w:multiLevelType w:val="multilevel"/>
     <w:tmpl w:val="CBCE29EC"/>
@@ -10274,13 +11632,13 @@
     <w:abstractNumId w:val="31"/>
   </w:num>
   <w:num w:numId="3" w16cid:durableId="25252092">
-    <w:abstractNumId w:val="63"/>
+    <w:abstractNumId w:val="64"/>
   </w:num>
   <w:num w:numId="4" w16cid:durableId="1950354317">
     <w:abstractNumId w:val="11"/>
   </w:num>
   <w:num w:numId="5" w16cid:durableId="827719688">
-    <w:abstractNumId w:val="49"/>
+    <w:abstractNumId w:val="50"/>
   </w:num>
   <w:num w:numId="6" w16cid:durableId="4480488">
     <w:abstractNumId w:val="47"/>
@@ -10295,13 +11653,13 @@
     <w:abstractNumId w:val="25"/>
   </w:num>
   <w:num w:numId="10" w16cid:durableId="676733998">
+    <w:abstractNumId w:val="67"/>
+  </w:num>
+  <w:num w:numId="11" w16cid:durableId="603921088">
     <w:abstractNumId w:val="66"/>
   </w:num>
-  <w:num w:numId="11" w16cid:durableId="603921088">
-    <w:abstractNumId w:val="65"/>
-  </w:num>
   <w:num w:numId="12" w16cid:durableId="1690371440">
-    <w:abstractNumId w:val="48"/>
+    <w:abstractNumId w:val="49"/>
   </w:num>
   <w:num w:numId="13" w16cid:durableId="1022782029">
     <w:abstractNumId w:val="45"/>
@@ -10310,7 +11668,7 @@
     <w:abstractNumId w:val="14"/>
   </w:num>
   <w:num w:numId="15" w16cid:durableId="1190337458">
-    <w:abstractNumId w:val="52"/>
+    <w:abstractNumId w:val="53"/>
   </w:num>
   <w:num w:numId="16" w16cid:durableId="1010525220">
     <w:abstractNumId w:val="18"/>
@@ -10322,7 +11680,7 @@
     <w:abstractNumId w:val="32"/>
   </w:num>
   <w:num w:numId="19" w16cid:durableId="1272929669">
-    <w:abstractNumId w:val="59"/>
+    <w:abstractNumId w:val="60"/>
   </w:num>
   <w:num w:numId="20" w16cid:durableId="985859896">
     <w:abstractNumId w:val="6"/>
@@ -10343,13 +11701,13 @@
     <w:abstractNumId w:val="34"/>
   </w:num>
   <w:num w:numId="26" w16cid:durableId="1582106716">
-    <w:abstractNumId w:val="64"/>
+    <w:abstractNumId w:val="65"/>
   </w:num>
   <w:num w:numId="27" w16cid:durableId="278033669">
-    <w:abstractNumId w:val="58"/>
+    <w:abstractNumId w:val="59"/>
   </w:num>
   <w:num w:numId="28" w16cid:durableId="659236520">
-    <w:abstractNumId w:val="62"/>
+    <w:abstractNumId w:val="63"/>
   </w:num>
   <w:num w:numId="29" w16cid:durableId="1358501807">
     <w:abstractNumId w:val="19"/>
@@ -10364,13 +11722,13 @@
     <w:abstractNumId w:val="3"/>
   </w:num>
   <w:num w:numId="33" w16cid:durableId="216284392">
-    <w:abstractNumId w:val="55"/>
+    <w:abstractNumId w:val="56"/>
   </w:num>
   <w:num w:numId="34" w16cid:durableId="2041271912">
-    <w:abstractNumId w:val="53"/>
+    <w:abstractNumId w:val="54"/>
   </w:num>
   <w:num w:numId="35" w16cid:durableId="1253467776">
-    <w:abstractNumId w:val="60"/>
+    <w:abstractNumId w:val="61"/>
   </w:num>
   <w:num w:numId="36" w16cid:durableId="125050265">
     <w:abstractNumId w:val="35"/>
@@ -10382,7 +11740,7 @@
     <w:abstractNumId w:val="23"/>
   </w:num>
   <w:num w:numId="39" w16cid:durableId="1701977568">
-    <w:abstractNumId w:val="51"/>
+    <w:abstractNumId w:val="52"/>
   </w:num>
   <w:num w:numId="40" w16cid:durableId="724521648">
     <w:abstractNumId w:val="9"/>
@@ -10436,10 +11794,10 @@
     <w:abstractNumId w:val="30"/>
   </w:num>
   <w:num w:numId="48" w16cid:durableId="1307050180">
-    <w:abstractNumId w:val="57"/>
+    <w:abstractNumId w:val="58"/>
   </w:num>
   <w:num w:numId="49" w16cid:durableId="589580574">
-    <w:abstractNumId w:val="56"/>
+    <w:abstractNumId w:val="57"/>
   </w:num>
   <w:num w:numId="50" w16cid:durableId="211233357">
     <w:abstractNumId w:val="46"/>
@@ -10457,7 +11815,7 @@
     <w:abstractNumId w:val="10"/>
   </w:num>
   <w:num w:numId="55" w16cid:durableId="599877682">
-    <w:abstractNumId w:val="50"/>
+    <w:abstractNumId w:val="51"/>
   </w:num>
   <w:num w:numId="56" w16cid:durableId="204803403">
     <w:abstractNumId w:val="44"/>
@@ -10466,10 +11824,10 @@
     <w:abstractNumId w:val="43"/>
   </w:num>
   <w:num w:numId="58" w16cid:durableId="1199776227">
-    <w:abstractNumId w:val="67"/>
+    <w:abstractNumId w:val="68"/>
   </w:num>
   <w:num w:numId="59" w16cid:durableId="1591809654">
-    <w:abstractNumId w:val="54"/>
+    <w:abstractNumId w:val="55"/>
   </w:num>
   <w:num w:numId="60" w16cid:durableId="1147818525">
     <w:abstractNumId w:val="20"/>
@@ -10490,13 +11848,16 @@
     <w:abstractNumId w:val="21"/>
   </w:num>
   <w:num w:numId="66" w16cid:durableId="374814183">
-    <w:abstractNumId w:val="61"/>
+    <w:abstractNumId w:val="62"/>
   </w:num>
   <w:num w:numId="67" w16cid:durableId="726999348">
     <w:abstractNumId w:val="4"/>
   </w:num>
   <w:num w:numId="68" w16cid:durableId="96798618">
     <w:abstractNumId w:val="0"/>
+  </w:num>
+  <w:num w:numId="69" w16cid:durableId="791442942">
+    <w:abstractNumId w:val="48"/>
   </w:num>
 </w:numbering>
 </file>

</xml_diff>